<commit_message>
Actualicé el Capítulo 1 con correcciones
</commit_message>
<xml_diff>
--- a/Documentacion/Informe capitulo 1.docx
+++ b/Documentacion/Informe capitulo 1.docx
@@ -609,14 +609,7 @@
           <w:b/>
           <w:bCs w:val="0"/>
         </w:rPr>
-        <w:t xml:space="preserve">1.1 </w:t>
-      </w:r>
-      <w:r>
-        <w:rPr>
-          <w:b/>
-          <w:bCs w:val="0"/>
-        </w:rPr>
-        <w:t>Objetivo del Sistema</w:t>
+        <w:t>1.1 Objetivo del Sistema</w:t>
       </w:r>
     </w:p>
     <w:p>
@@ -802,10 +795,7 @@
         <w:pStyle w:val="titulo3"/>
       </w:pPr>
       <w:r>
-        <w:t xml:space="preserve">1.3.1 </w:t>
-      </w:r>
-      <w:r>
-        <w:t>Gestor de Pacientes</w:t>
+        <w:t>1.3.1 Gestor de Pacientes</w:t>
       </w:r>
     </w:p>
     <w:p>
@@ -1464,7 +1454,25 @@
         <w:ind w:left="567" w:firstLine="0"/>
       </w:pPr>
       <w:r>
-        <w:t>Se utilizará una lista enlazada para almacenar todos los pacientes registrados en el sistema.</w:t>
+        <w:t>La lista enlazada simple permitirá almacenar dinámicamente la información de los pacientes sin necesidad de utilizar tamaños fijos de memoria. Por lo tanto, cada paciente será representado mediante un nodo conectado al siguiente a través de punteros.</w:t>
+      </w:r>
+      <w:r>
+        <w:t xml:space="preserve"> </w:t>
+      </w:r>
+      <w:r>
+        <w:t>Asimis</w:t>
+      </w:r>
+      <w:r>
+        <w:t>m</w:t>
+      </w:r>
+      <w:r>
+        <w:t>o, esta estructura facilitará la inserción y eliminación de pacientes durante la ejecución del programa, ya que en un entorno hospitalario constantemente ingresan y salen nuevos pacientes.</w:t>
+      </w:r>
+      <w:r>
+        <w:t xml:space="preserve"> </w:t>
+      </w:r>
+      <w:r>
+        <w:t>Por consiguiente, se utilizará una lista enlazada para almacenar todos los pacientes registrados en el sistema.</w:t>
       </w:r>
     </w:p>
     <w:p>
@@ -1598,10 +1606,10 @@
     <w:p>
       <w:pPr>
         <w:pStyle w:val="cuerpo2"/>
-        <w:ind w:left="579" w:firstLine="708"/>
-      </w:pPr>
-      <w:r>
-        <w:t>Permite agregar un nuevo paciente al final de la lista.</w:t>
+        <w:ind w:left="1287" w:firstLine="0"/>
+      </w:pPr>
+      <w:r>
+        <w:t>Permite agregar un nuevo paciente al final de la lista. De esta manera, el sistema podrá registrar continuamente nuevos ingresos hospitalarios.</w:t>
       </w:r>
     </w:p>
     <w:p>
@@ -1619,10 +1627,11 @@
     <w:p>
       <w:pPr>
         <w:pStyle w:val="cuerpo2"/>
-        <w:ind w:left="579" w:firstLine="708"/>
-      </w:pPr>
-      <w:r>
-        <w:t>Recorre la lista hasta encontrar un paciente mediante ID o nombre.</w:t>
+        <w:ind w:left="1287" w:firstLine="0"/>
+      </w:pPr>
+      <w:r>
+        <w:lastRenderedPageBreak/>
+        <w:t>Permite recorrer la lista hasta encontrar un paciente mediante su ID o nombre. Por ello, el personal médico podrá localizar información rápidamente.</w:t>
       </w:r>
     </w:p>
     <w:p>
@@ -1640,10 +1649,10 @@
     <w:p>
       <w:pPr>
         <w:pStyle w:val="cuerpo2"/>
-        <w:ind w:left="579" w:firstLine="708"/>
-      </w:pPr>
-      <w:r>
-        <w:t>Permite retirar un paciente de la lista cuando recibe alta médica.</w:t>
+        <w:ind w:left="1287" w:firstLine="0"/>
+      </w:pPr>
+      <w:r>
+        <w:t>Permite retirar un paciente de la lista cuando recibe alta médica. En consecuencia, la información del sistema permanecerá actualizada.</w:t>
       </w:r>
     </w:p>
     <w:p>
@@ -1660,16 +1669,16 @@
     </w:p>
     <w:p>
       <w:pPr>
-        <w:pStyle w:val="cuerpo2"/>
-        <w:ind w:left="579" w:firstLine="708"/>
-      </w:pPr>
-      <w:r>
-        <w:t>Recorre toda la lista mostrando la información almacenada.</w:t>
-      </w:r>
-    </w:p>
-    <w:p>
-      <w:pPr>
         <w:pStyle w:val="Titulo2"/>
+        <w:ind w:left="1275" w:firstLine="0"/>
+      </w:pPr>
+      <w:r>
+        <w:t>Permite recorrer toda la lista mostrando la información almacenada. Así, el personal podrá visualizar todos los pacientes registrados.</w:t>
+      </w:r>
+    </w:p>
+    <w:p>
+      <w:pPr>
+        <w:pStyle w:val="Titulo2"/>
         <w:rPr>
           <w:b/>
           <w:bCs w:val="0"/>
@@ -1680,7 +1689,6 @@
           <w:b/>
           <w:bCs w:val="0"/>
         </w:rPr>
-        <w:lastRenderedPageBreak/>
         <w:t>3.2 Cola dinámica</w:t>
       </w:r>
     </w:p>
@@ -1690,18 +1698,72 @@
         <w:ind w:left="567" w:firstLine="0"/>
       </w:pPr>
       <w:r>
-        <w:t>La cola permitirá organizar la atención médica según la gravedad del paciente.</w:t>
-      </w:r>
-      <w:r>
-        <w:t xml:space="preserve"> Por lo tanto, l</w:t>
-      </w:r>
-      <w:r>
-        <w:t>os pacientes más graves serán atendidos primero.</w:t>
-      </w:r>
-    </w:p>
-    <w:p>
-      <w:pPr>
-        <w:pStyle w:val="cuerpo2"/>
+        <w:t xml:space="preserve">La cola dinámica funciona siguiendo el principio FIFO (First In, First </w:t>
+      </w:r>
+      <w:proofErr w:type="spellStart"/>
+      <w:r>
+        <w:t>Out</w:t>
+      </w:r>
+      <w:proofErr w:type="spellEnd"/>
+      <w:r>
+        <w:t>), donde el primer elemento en ingresar es el primero en salir. Sin embargo, en este sistema hospitalario se utilizará una cola de prioridad, debido a que los pacientes con mayor gravedad médica deberán ser atendidos antes que los demás, independientemente del orden de llegada.</w:t>
+      </w:r>
+      <w:r>
+        <w:t xml:space="preserve"> </w:t>
+      </w:r>
+      <w:r>
+        <w:t>Por ello, cada paciente será insertado según su nivel de prioridad:</w:t>
+      </w:r>
+    </w:p>
+    <w:p>
+      <w:pPr>
+        <w:pStyle w:val="cuerpo2"/>
+        <w:numPr>
+          <w:ilvl w:val="0"/>
+          <w:numId w:val="22"/>
+        </w:numPr>
+      </w:pPr>
+      <w:r>
+        <w:t>Prioridad alta: atención inmediata.</w:t>
+      </w:r>
+    </w:p>
+    <w:p>
+      <w:pPr>
+        <w:pStyle w:val="cuerpo2"/>
+        <w:numPr>
+          <w:ilvl w:val="0"/>
+          <w:numId w:val="22"/>
+        </w:numPr>
+      </w:pPr>
+      <w:r>
+        <w:t>Prioridad media: atención moderada.</w:t>
+      </w:r>
+    </w:p>
+    <w:p>
+      <w:pPr>
+        <w:pStyle w:val="cuerpo2"/>
+        <w:numPr>
+          <w:ilvl w:val="0"/>
+          <w:numId w:val="22"/>
+        </w:numPr>
+      </w:pPr>
+      <w:r>
+        <w:t>Prioridad baja: puede esperar algunos minutos.</w:t>
+      </w:r>
+    </w:p>
+    <w:p>
+      <w:pPr>
+        <w:pStyle w:val="cuerpo2"/>
+        <w:ind w:left="567" w:firstLine="0"/>
+      </w:pPr>
+      <w:r>
+        <w:t>De esta manera, la cola dinámica permitirá mantener organizado el flujo de pacientes en el área de emergencias.</w:t>
+      </w:r>
+    </w:p>
+    <w:p>
+      <w:pPr>
+        <w:pStyle w:val="cuerpo2"/>
+        <w:ind w:left="567" w:firstLine="0"/>
         <w:rPr>
           <w:b/>
           <w:bCs w:val="0"/>
@@ -1730,6 +1792,15 @@
     <w:p>
       <w:pPr>
         <w:pStyle w:val="cuerpo2"/>
+        <w:ind w:left="1287" w:firstLine="0"/>
+      </w:pPr>
+      <w:r>
+        <w:t>Permite insertar pacientes en la cola según su prioridad médica. Por consiguiente, los casos más graves serán ubicados en las primeras posiciones.</w:t>
+      </w:r>
+    </w:p>
+    <w:p>
+      <w:pPr>
+        <w:pStyle w:val="cuerpo2"/>
         <w:numPr>
           <w:ilvl w:val="0"/>
           <w:numId w:val="15"/>
@@ -1742,6 +1813,15 @@
     <w:p>
       <w:pPr>
         <w:pStyle w:val="cuerpo2"/>
+        <w:ind w:left="1287" w:firstLine="0"/>
+      </w:pPr>
+      <w:r>
+        <w:t>Permite retirar al paciente que será atendido. Así, el sistema mantendrá actualizado el orden de atención.</w:t>
+      </w:r>
+    </w:p>
+    <w:p>
+      <w:pPr>
+        <w:pStyle w:val="cuerpo2"/>
         <w:numPr>
           <w:ilvl w:val="0"/>
           <w:numId w:val="15"/>
@@ -1754,6 +1834,15 @@
     <w:p>
       <w:pPr>
         <w:pStyle w:val="cuerpo2"/>
+        <w:ind w:left="1287" w:firstLine="0"/>
+      </w:pPr>
+      <w:r>
+        <w:t>Permite visualizar los pacientes pendientes de atención. Además, facilita el control del flujo hospitalario.</w:t>
+      </w:r>
+    </w:p>
+    <w:p>
+      <w:pPr>
+        <w:pStyle w:val="cuerpo2"/>
         <w:numPr>
           <w:ilvl w:val="0"/>
           <w:numId w:val="15"/>
@@ -1765,6 +1854,16 @@
     </w:p>
     <w:p>
       <w:pPr>
+        <w:pStyle w:val="cuerpo2"/>
+        <w:ind w:left="1287" w:firstLine="0"/>
+      </w:pPr>
+      <w:r>
+        <w:lastRenderedPageBreak/>
+        <w:t>Permite comprobar si existen pacientes en espera. En consecuencia, el personal podrá saber si aún quedan pacientes por atender.</w:t>
+      </w:r>
+    </w:p>
+    <w:p>
+      <w:pPr>
         <w:pStyle w:val="Titulo2"/>
         <w:rPr>
           <w:b/>
@@ -1785,18 +1884,36 @@
         <w:ind w:left="567" w:firstLine="0"/>
       </w:pPr>
       <w:r>
-        <w:t>La pila será utilizada para administrar camas o recursos disponibles.</w:t>
-      </w:r>
-      <w:r>
-        <w:t xml:space="preserve"> Por ello, l</w:t>
-      </w:r>
-      <w:r>
-        <w:t>a última cama liberada podrá ser reutilizada primero.</w:t>
-      </w:r>
-    </w:p>
-    <w:p>
-      <w:pPr>
-        <w:pStyle w:val="cuerpo2"/>
+        <w:t xml:space="preserve">La pila dinámica funciona siguiendo el principio LIFO (Last In, First </w:t>
+      </w:r>
+      <w:proofErr w:type="spellStart"/>
+      <w:r>
+        <w:t>Out</w:t>
+      </w:r>
+      <w:proofErr w:type="spellEnd"/>
+      <w:r>
+        <w:t>), lo que significa que el último elemento en ingresar será el primero en salir.</w:t>
+      </w:r>
+    </w:p>
+    <w:p>
+      <w:pPr>
+        <w:pStyle w:val="cuerpo2"/>
+        <w:ind w:left="567" w:firstLine="0"/>
+      </w:pPr>
+      <w:r>
+        <w:t>En el sistema hospitalario, esta estructura será utilizada para administrar camas disponibles. Por ejemplo, cuando una cama es liberada, esta se almacenará nuevamente en la pila para que pueda reutilizarse rápidamente cuando llegue un nuevo paciente.</w:t>
+      </w:r>
+      <w:r>
+        <w:t xml:space="preserve"> </w:t>
+      </w:r>
+      <w:r>
+        <w:t>Asimismo, la pila facilitará el control ordenado de recursos hospitalarios y permitirá realizar asignaciones y liberaciones de camas de manera eficiente.</w:t>
+      </w:r>
+    </w:p>
+    <w:p>
+      <w:pPr>
+        <w:pStyle w:val="cuerpo2"/>
+        <w:ind w:left="567" w:firstLine="0"/>
         <w:rPr>
           <w:b/>
           <w:bCs w:val="0"/>
@@ -1825,6 +1942,15 @@
     <w:p>
       <w:pPr>
         <w:pStyle w:val="cuerpo2"/>
+        <w:ind w:left="1287" w:firstLine="0"/>
+      </w:pPr>
+      <w:r>
+        <w:t>Permite registrar una cama disponible en la pila. De esta forma, el sistema mantendrá actualizado el registro de camas libres.</w:t>
+      </w:r>
+    </w:p>
+    <w:p>
+      <w:pPr>
+        <w:pStyle w:val="cuerpo2"/>
         <w:numPr>
           <w:ilvl w:val="0"/>
           <w:numId w:val="17"/>
@@ -1837,6 +1963,15 @@
     <w:p>
       <w:pPr>
         <w:pStyle w:val="cuerpo2"/>
+        <w:ind w:left="1287" w:firstLine="0"/>
+      </w:pPr>
+      <w:r>
+        <w:t>Permite retirar una cama de la pila para asignarla a un paciente. Por ello, la atención médica podrá realizarse de manera más rápida.</w:t>
+      </w:r>
+    </w:p>
+    <w:p>
+      <w:pPr>
+        <w:pStyle w:val="cuerpo2"/>
         <w:numPr>
           <w:ilvl w:val="0"/>
           <w:numId w:val="17"/>
@@ -1849,6 +1984,15 @@
     <w:p>
       <w:pPr>
         <w:pStyle w:val="cuerpo2"/>
+        <w:ind w:left="1287" w:firstLine="0"/>
+      </w:pPr>
+      <w:r>
+        <w:t>Permite visualizar la última cama registrada sin eliminarla. Así, el personal podrá consultar información sin modificar la estructura.</w:t>
+      </w:r>
+    </w:p>
+    <w:p>
+      <w:pPr>
+        <w:pStyle w:val="cuerpo2"/>
         <w:numPr>
           <w:ilvl w:val="0"/>
           <w:numId w:val="17"/>
@@ -1860,6 +2004,15 @@
     </w:p>
     <w:p>
       <w:pPr>
+        <w:pStyle w:val="NormalWeb"/>
+        <w:ind w:left="1287"/>
+      </w:pPr>
+      <w:r>
+        <w:t>Permite visualizar todas las camas disponibles. En consecuencia, se facilitará la administración hospitalaria.</w:t>
+      </w:r>
+    </w:p>
+    <w:p>
+      <w:pPr>
         <w:pStyle w:val="cuerpo2"/>
         <w:ind w:firstLine="0"/>
         <w:rPr>
@@ -1879,27 +2032,44 @@
       <w:pPr>
         <w:pStyle w:val="Cuerpo1"/>
         <w:ind w:left="284" w:firstLine="0"/>
+        <w:jc w:val="both"/>
       </w:pPr>
       <w:r>
         <w:t>Las estructuras dinámicas lineales seleccionadas permiten resolver eficientemente el problema planteado en el sistema hospitalario.</w:t>
       </w:r>
       <w:r>
-        <w:t xml:space="preserve"> En primer lugar, l</w:t>
-      </w:r>
-      <w:r>
-        <w:t>a lista enlazada facilita el almacenamiento dinámico de pacientes.</w:t>
-      </w:r>
-      <w:r>
-        <w:t xml:space="preserve"> En segundo lugar, l</w:t>
-      </w:r>
-      <w:r>
-        <w:t>a cola dinámica permite organizar correctamente la atención médica según prioridad.</w:t>
-      </w:r>
-      <w:r>
-        <w:t xml:space="preserve"> En tercer lugar, l</w:t>
-      </w:r>
-      <w:r>
-        <w:t>a pila dinámica ayuda a administrar recursos hospitalarios de manera ordenada.</w:t>
+        <w:t xml:space="preserve"> </w:t>
+      </w:r>
+      <w:r>
+        <w:t>En primer lugar, la lista enlazada facilita el almacenamiento dinámico de pacientes, permitiendo agregar o eliminar registros sin necesidad de utilizar arreglos de tamaño fijo. Por lo tanto, el sistema tendrá mayor flexibilidad durante la ejecución.</w:t>
+      </w:r>
+      <w:r>
+        <w:t xml:space="preserve"> </w:t>
+      </w:r>
+      <w:r>
+        <w:t>En segundo lugar, la cola dinámica permite organizar correctamente la atención médica según prioridad. De esta manera, los pacientes con mayor gravedad podrán ser atendidos primero.</w:t>
+      </w:r>
+      <w:r>
+        <w:t xml:space="preserve"> </w:t>
+      </w:r>
+      <w:r>
+        <w:t>En tercer lugar, la pila dinámica ayuda a administrar recursos hospitalarios de manera ordenada, especialmente en el control de camas disponibles.</w:t>
+      </w:r>
+      <w:r>
+        <w:t xml:space="preserve"> </w:t>
+      </w:r>
+      <w:r>
+        <w:t xml:space="preserve">Asimismo, las estructuras dinámicas permiten utilizar memoria dinámica, lo cual significa que el programa podrá reservar memoria durante la ejecución según la cantidad de </w:t>
+      </w:r>
+      <w:r>
+        <w:lastRenderedPageBreak/>
+        <w:t>pacientes registrados. En consecuencia, se evitará el desperdicio de recursos y se obtendrá un sistema más eficiente.</w:t>
+      </w:r>
+      <w:r>
+        <w:t xml:space="preserve"> </w:t>
+      </w:r>
+      <w:r>
+        <w:t>Además, las operaciones principales como inserción, eliminación y búsqueda tendrán una complejidad adecuada para el tamaño esperado del sistema hospitalario, permitiendo un funcionamiento eficiente durante la ejecución del programa.</w:t>
       </w:r>
     </w:p>
     <w:p>
@@ -2031,7 +2201,6 @@
         <w:pStyle w:val="cuerpo2"/>
       </w:pPr>
       <w:r>
-        <w:lastRenderedPageBreak/>
         <w:t>-</w:t>
       </w:r>
       <w:r>
@@ -2109,25 +2278,25 @@
         <w:ind w:left="567" w:firstLine="0"/>
       </w:pPr>
       <w:r>
-        <w:t>El análisis realizado permit</w:t>
-      </w:r>
-      <w:r>
-        <w:t>e</w:t>
-      </w:r>
-      <w:r>
-        <w:t xml:space="preserve"> identificar los problemas relacionados con la organización de pacientes en un área de emergencias hospitalarias.</w:t>
-      </w:r>
-      <w:r>
-        <w:t xml:space="preserve"> Asimismo, l</w:t>
-      </w:r>
-      <w:r>
-        <w:t>as estructuras dinámicas lineales propuestas ofrecen una solución adecuada para registrar pacientes, administrar prioridades y controlar recursos hospitalarios.</w:t>
-      </w:r>
-      <w:r>
-        <w:t xml:space="preserve"> Finalmente, e</w:t>
-      </w:r>
-      <w:r>
-        <w:t>l desarrollo del sistema permitirá aplicar los conocimientos aprendidos en el curso de Estructura de Datos mediante una aplicación real implementada en lenguaje C++ usando DEV C++.</w:t>
+        <w:t>El análisis realizado permitió identificar los principales problemas relacionados con la atención y organización de pacientes en el área de emergencias hospitalarias.</w:t>
+      </w:r>
+      <w:r>
+        <w:t xml:space="preserve"> </w:t>
+      </w:r>
+      <w:r>
+        <w:t>Mediante el uso de estructuras dinámicas lineales como listas enlazadas, colas y pilas, el sistema podrá gestionar de manera eficiente el registro de pacientes, la prioridad de atención y la administración de camas disponibles.</w:t>
+      </w:r>
+      <w:r>
+        <w:t xml:space="preserve"> </w:t>
+      </w:r>
+      <w:r>
+        <w:t>Asimismo, el desarrollo de este proyecto permitirá aplicar los conocimientos adquiridos en el curso de Estructura de Datos utilizando programación en C++ mediante DEV C++, fortaleciendo tanto las habilidades técnicas como la capacidad de resolver problemas reales mediante software.</w:t>
+      </w:r>
+      <w:r>
+        <w:t xml:space="preserve"> </w:t>
+      </w:r>
+      <w:r>
+        <w:t>Finalmente, el sistema contribuirá a mejorar la organización hospitalaria, reducir errores en la atención y optimizar el uso de recursos médicos dentro del área de emergencias.</w:t>
       </w:r>
     </w:p>
     <w:p>
@@ -2142,12 +2311,6 @@
           <w:b/>
           <w:bCs w:val="0"/>
         </w:rPr>
-      </w:pPr>
-    </w:p>
-    <w:p>
-      <w:pPr>
-        <w:pStyle w:val="cuerpo2"/>
-        <w:ind w:left="567" w:firstLine="0"/>
       </w:pPr>
     </w:p>
     <w:sectPr>
@@ -2461,6 +2624,92 @@
     </w:lvl>
   </w:abstractNum>
   <w:abstractNum w:abstractNumId="2" w15:restartNumberingAfterBreak="0">
+    <w:nsid w:val="10540AAB"/>
+    <w:multiLevelType w:val="hybridMultilevel"/>
+    <w:tmpl w:val="D68EC48C"/>
+    <w:lvl w:ilvl="0" w:tplc="280A000F">
+      <w:start w:val="1"/>
+      <w:numFmt w:val="decimal"/>
+      <w:lvlText w:val="%1."/>
+      <w:lvlJc w:val="left"/>
+      <w:pPr>
+        <w:ind w:left="1287" w:hanging="360"/>
+      </w:pPr>
+    </w:lvl>
+    <w:lvl w:ilvl="1" w:tplc="280A0019" w:tentative="1">
+      <w:start w:val="1"/>
+      <w:numFmt w:val="lowerLetter"/>
+      <w:lvlText w:val="%2."/>
+      <w:lvlJc w:val="left"/>
+      <w:pPr>
+        <w:ind w:left="2007" w:hanging="360"/>
+      </w:pPr>
+    </w:lvl>
+    <w:lvl w:ilvl="2" w:tplc="280A001B" w:tentative="1">
+      <w:start w:val="1"/>
+      <w:numFmt w:val="lowerRoman"/>
+      <w:lvlText w:val="%3."/>
+      <w:lvlJc w:val="right"/>
+      <w:pPr>
+        <w:ind w:left="2727" w:hanging="180"/>
+      </w:pPr>
+    </w:lvl>
+    <w:lvl w:ilvl="3" w:tplc="280A000F" w:tentative="1">
+      <w:start w:val="1"/>
+      <w:numFmt w:val="decimal"/>
+      <w:lvlText w:val="%4."/>
+      <w:lvlJc w:val="left"/>
+      <w:pPr>
+        <w:ind w:left="3447" w:hanging="360"/>
+      </w:pPr>
+    </w:lvl>
+    <w:lvl w:ilvl="4" w:tplc="280A0019" w:tentative="1">
+      <w:start w:val="1"/>
+      <w:numFmt w:val="lowerLetter"/>
+      <w:lvlText w:val="%5."/>
+      <w:lvlJc w:val="left"/>
+      <w:pPr>
+        <w:ind w:left="4167" w:hanging="360"/>
+      </w:pPr>
+    </w:lvl>
+    <w:lvl w:ilvl="5" w:tplc="280A001B" w:tentative="1">
+      <w:start w:val="1"/>
+      <w:numFmt w:val="lowerRoman"/>
+      <w:lvlText w:val="%6."/>
+      <w:lvlJc w:val="right"/>
+      <w:pPr>
+        <w:ind w:left="4887" w:hanging="180"/>
+      </w:pPr>
+    </w:lvl>
+    <w:lvl w:ilvl="6" w:tplc="280A000F" w:tentative="1">
+      <w:start w:val="1"/>
+      <w:numFmt w:val="decimal"/>
+      <w:lvlText w:val="%7."/>
+      <w:lvlJc w:val="left"/>
+      <w:pPr>
+        <w:ind w:left="5607" w:hanging="360"/>
+      </w:pPr>
+    </w:lvl>
+    <w:lvl w:ilvl="7" w:tplc="280A0019" w:tentative="1">
+      <w:start w:val="1"/>
+      <w:numFmt w:val="lowerLetter"/>
+      <w:lvlText w:val="%8."/>
+      <w:lvlJc w:val="left"/>
+      <w:pPr>
+        <w:ind w:left="6327" w:hanging="360"/>
+      </w:pPr>
+    </w:lvl>
+    <w:lvl w:ilvl="8" w:tplc="280A001B" w:tentative="1">
+      <w:start w:val="1"/>
+      <w:numFmt w:val="lowerRoman"/>
+      <w:lvlText w:val="%9."/>
+      <w:lvlJc w:val="right"/>
+      <w:pPr>
+        <w:ind w:left="7047" w:hanging="180"/>
+      </w:pPr>
+    </w:lvl>
+  </w:abstractNum>
+  <w:abstractNum w:abstractNumId="3" w15:restartNumberingAfterBreak="0">
     <w:nsid w:val="152850D8"/>
     <w:multiLevelType w:val="hybridMultilevel"/>
     <w:tmpl w:val="9036FBAA"/>
@@ -2546,7 +2795,7 @@
       </w:pPr>
     </w:lvl>
   </w:abstractNum>
-  <w:abstractNum w:abstractNumId="3" w15:restartNumberingAfterBreak="0">
+  <w:abstractNum w:abstractNumId="4" w15:restartNumberingAfterBreak="0">
     <w:nsid w:val="17D15432"/>
     <w:multiLevelType w:val="hybridMultilevel"/>
     <w:tmpl w:val="B6660962"/>
@@ -2632,7 +2881,7 @@
       </w:pPr>
     </w:lvl>
   </w:abstractNum>
-  <w:abstractNum w:abstractNumId="4" w15:restartNumberingAfterBreak="0">
+  <w:abstractNum w:abstractNumId="5" w15:restartNumberingAfterBreak="0">
     <w:nsid w:val="184C4057"/>
     <w:multiLevelType w:val="hybridMultilevel"/>
     <w:tmpl w:val="0FC2CFA6"/>
@@ -2718,7 +2967,7 @@
       </w:pPr>
     </w:lvl>
   </w:abstractNum>
-  <w:abstractNum w:abstractNumId="5" w15:restartNumberingAfterBreak="0">
+  <w:abstractNum w:abstractNumId="6" w15:restartNumberingAfterBreak="0">
     <w:nsid w:val="1CFA693C"/>
     <w:multiLevelType w:val="hybridMultilevel"/>
     <w:tmpl w:val="DF44BE1A"/>
@@ -2804,7 +3053,7 @@
       </w:pPr>
     </w:lvl>
   </w:abstractNum>
-  <w:abstractNum w:abstractNumId="6" w15:restartNumberingAfterBreak="0">
+  <w:abstractNum w:abstractNumId="7" w15:restartNumberingAfterBreak="0">
     <w:nsid w:val="29736DBB"/>
     <w:multiLevelType w:val="multilevel"/>
     <w:tmpl w:val="FB440746"/>
@@ -2953,7 +3202,7 @@
       </w:rPr>
     </w:lvl>
   </w:abstractNum>
-  <w:abstractNum w:abstractNumId="7" w15:restartNumberingAfterBreak="0">
+  <w:abstractNum w:abstractNumId="8" w15:restartNumberingAfterBreak="0">
     <w:nsid w:val="2C323741"/>
     <w:multiLevelType w:val="hybridMultilevel"/>
     <w:tmpl w:val="FD10F6E8"/>
@@ -3039,7 +3288,7 @@
       </w:pPr>
     </w:lvl>
   </w:abstractNum>
-  <w:abstractNum w:abstractNumId="8" w15:restartNumberingAfterBreak="0">
+  <w:abstractNum w:abstractNumId="9" w15:restartNumberingAfterBreak="0">
     <w:nsid w:val="3BDE6E4D"/>
     <w:multiLevelType w:val="hybridMultilevel"/>
     <w:tmpl w:val="8504797C"/>
@@ -3125,7 +3374,7 @@
       </w:pPr>
     </w:lvl>
   </w:abstractNum>
-  <w:abstractNum w:abstractNumId="9" w15:restartNumberingAfterBreak="0">
+  <w:abstractNum w:abstractNumId="10" w15:restartNumberingAfterBreak="0">
     <w:nsid w:val="47B70059"/>
     <w:multiLevelType w:val="hybridMultilevel"/>
     <w:tmpl w:val="03A424E2"/>
@@ -3211,10 +3460,10 @@
       </w:pPr>
     </w:lvl>
   </w:abstractNum>
-  <w:abstractNum w:abstractNumId="10" w15:restartNumberingAfterBreak="0">
+  <w:abstractNum w:abstractNumId="11" w15:restartNumberingAfterBreak="0">
     <w:nsid w:val="4BA81FA6"/>
     <w:multiLevelType w:val="hybridMultilevel"/>
-    <w:tmpl w:val="4CD62504"/>
+    <w:tmpl w:val="83CCB5F2"/>
     <w:lvl w:ilvl="0" w:tplc="280A000F">
       <w:start w:val="1"/>
       <w:numFmt w:val="decimal"/>
@@ -3297,7 +3546,7 @@
       </w:pPr>
     </w:lvl>
   </w:abstractNum>
-  <w:abstractNum w:abstractNumId="11" w15:restartNumberingAfterBreak="0">
+  <w:abstractNum w:abstractNumId="12" w15:restartNumberingAfterBreak="0">
     <w:nsid w:val="4C3F59F9"/>
     <w:multiLevelType w:val="multilevel"/>
     <w:tmpl w:val="BC56A8CC"/>
@@ -3446,7 +3695,7 @@
       </w:rPr>
     </w:lvl>
   </w:abstractNum>
-  <w:abstractNum w:abstractNumId="12" w15:restartNumberingAfterBreak="0">
+  <w:abstractNum w:abstractNumId="13" w15:restartNumberingAfterBreak="0">
     <w:nsid w:val="503257D1"/>
     <w:multiLevelType w:val="hybridMultilevel"/>
     <w:tmpl w:val="82B03270"/>
@@ -3532,7 +3781,7 @@
       </w:pPr>
     </w:lvl>
   </w:abstractNum>
-  <w:abstractNum w:abstractNumId="13" w15:restartNumberingAfterBreak="0">
+  <w:abstractNum w:abstractNumId="14" w15:restartNumberingAfterBreak="0">
     <w:nsid w:val="53360601"/>
     <w:multiLevelType w:val="multilevel"/>
     <w:tmpl w:val="2A7ADC5C"/>
@@ -3681,7 +3930,7 @@
       </w:rPr>
     </w:lvl>
   </w:abstractNum>
-  <w:abstractNum w:abstractNumId="14" w15:restartNumberingAfterBreak="0">
+  <w:abstractNum w:abstractNumId="15" w15:restartNumberingAfterBreak="0">
     <w:nsid w:val="56DC0149"/>
     <w:multiLevelType w:val="multilevel"/>
     <w:tmpl w:val="188ACDD6"/>
@@ -3830,7 +4079,7 @@
       </w:rPr>
     </w:lvl>
   </w:abstractNum>
-  <w:abstractNum w:abstractNumId="15" w15:restartNumberingAfterBreak="0">
+  <w:abstractNum w:abstractNumId="16" w15:restartNumberingAfterBreak="0">
     <w:nsid w:val="63B55877"/>
     <w:multiLevelType w:val="multilevel"/>
     <w:tmpl w:val="05BC75D6"/>
@@ -3979,7 +4228,7 @@
       </w:rPr>
     </w:lvl>
   </w:abstractNum>
-  <w:abstractNum w:abstractNumId="16" w15:restartNumberingAfterBreak="0">
+  <w:abstractNum w:abstractNumId="17" w15:restartNumberingAfterBreak="0">
     <w:nsid w:val="6D535E5B"/>
     <w:multiLevelType w:val="hybridMultilevel"/>
     <w:tmpl w:val="49769532"/>
@@ -4065,7 +4314,7 @@
       </w:pPr>
     </w:lvl>
   </w:abstractNum>
-  <w:abstractNum w:abstractNumId="17" w15:restartNumberingAfterBreak="0">
+  <w:abstractNum w:abstractNumId="18" w15:restartNumberingAfterBreak="0">
     <w:nsid w:val="73012DD5"/>
     <w:multiLevelType w:val="multilevel"/>
     <w:tmpl w:val="26F62B48"/>
@@ -4214,7 +4463,7 @@
       </w:rPr>
     </w:lvl>
   </w:abstractNum>
-  <w:abstractNum w:abstractNumId="18" w15:restartNumberingAfterBreak="0">
+  <w:abstractNum w:abstractNumId="19" w15:restartNumberingAfterBreak="0">
     <w:nsid w:val="73EA3377"/>
     <w:multiLevelType w:val="hybridMultilevel"/>
     <w:tmpl w:val="1028363E"/>
@@ -4300,7 +4549,7 @@
       </w:pPr>
     </w:lvl>
   </w:abstractNum>
-  <w:abstractNum w:abstractNumId="19" w15:restartNumberingAfterBreak="0">
+  <w:abstractNum w:abstractNumId="20" w15:restartNumberingAfterBreak="0">
     <w:nsid w:val="790510BA"/>
     <w:multiLevelType w:val="hybridMultilevel"/>
     <w:tmpl w:val="AA502BDA"/>
@@ -4386,7 +4635,7 @@
       </w:pPr>
     </w:lvl>
   </w:abstractNum>
-  <w:abstractNum w:abstractNumId="20" w15:restartNumberingAfterBreak="0">
+  <w:abstractNum w:abstractNumId="21" w15:restartNumberingAfterBreak="0">
     <w:nsid w:val="7B17047E"/>
     <w:multiLevelType w:val="hybridMultilevel"/>
     <w:tmpl w:val="F42A7632"/>
@@ -4473,67 +4722,70 @@
     </w:lvl>
   </w:abstractNum>
   <w:num w:numId="1" w16cid:durableId="637078259">
-    <w:abstractNumId w:val="11"/>
+    <w:abstractNumId w:val="12"/>
   </w:num>
   <w:num w:numId="2" w16cid:durableId="829836228">
-    <w:abstractNumId w:val="12"/>
+    <w:abstractNumId w:val="13"/>
   </w:num>
   <w:num w:numId="3" w16cid:durableId="1689288656">
-    <w:abstractNumId w:val="3"/>
+    <w:abstractNumId w:val="4"/>
   </w:num>
   <w:num w:numId="4" w16cid:durableId="1044138674">
     <w:abstractNumId w:val="1"/>
   </w:num>
   <w:num w:numId="5" w16cid:durableId="2065564152">
+    <w:abstractNumId w:val="10"/>
+  </w:num>
+  <w:num w:numId="6" w16cid:durableId="1253930101">
+    <w:abstractNumId w:val="19"/>
+  </w:num>
+  <w:num w:numId="7" w16cid:durableId="64845101">
+    <w:abstractNumId w:val="6"/>
+  </w:num>
+  <w:num w:numId="8" w16cid:durableId="114325483">
+    <w:abstractNumId w:val="15"/>
+  </w:num>
+  <w:num w:numId="9" w16cid:durableId="662701675">
+    <w:abstractNumId w:val="14"/>
+  </w:num>
+  <w:num w:numId="10" w16cid:durableId="224730057">
+    <w:abstractNumId w:val="3"/>
+  </w:num>
+  <w:num w:numId="11" w16cid:durableId="1919631467">
+    <w:abstractNumId w:val="21"/>
+  </w:num>
+  <w:num w:numId="12" w16cid:durableId="1897668200">
     <w:abstractNumId w:val="9"/>
   </w:num>
-  <w:num w:numId="6" w16cid:durableId="1253930101">
-    <w:abstractNumId w:val="18"/>
+  <w:num w:numId="13" w16cid:durableId="2018656728">
+    <w:abstractNumId w:val="11"/>
   </w:num>
-  <w:num w:numId="7" w16cid:durableId="64845101">
-    <w:abstractNumId w:val="5"/>
+  <w:num w:numId="14" w16cid:durableId="781338598">
+    <w:abstractNumId w:val="7"/>
   </w:num>
-  <w:num w:numId="8" w16cid:durableId="114325483">
-    <w:abstractNumId w:val="14"/>
+  <w:num w:numId="15" w16cid:durableId="1687095415">
+    <w:abstractNumId w:val="17"/>
   </w:num>
-  <w:num w:numId="9" w16cid:durableId="662701675">
-    <w:abstractNumId w:val="13"/>
+  <w:num w:numId="16" w16cid:durableId="16203515">
+    <w:abstractNumId w:val="16"/>
   </w:num>
-  <w:num w:numId="10" w16cid:durableId="224730057">
-    <w:abstractNumId w:val="2"/>
-  </w:num>
-  <w:num w:numId="11" w16cid:durableId="1919631467">
-    <w:abstractNumId w:val="20"/>
-  </w:num>
-  <w:num w:numId="12" w16cid:durableId="1897668200">
+  <w:num w:numId="17" w16cid:durableId="2138449025">
     <w:abstractNumId w:val="8"/>
   </w:num>
-  <w:num w:numId="13" w16cid:durableId="2018656728">
-    <w:abstractNumId w:val="10"/>
-  </w:num>
-  <w:num w:numId="14" w16cid:durableId="781338598">
-    <w:abstractNumId w:val="6"/>
-  </w:num>
-  <w:num w:numId="15" w16cid:durableId="1687095415">
-    <w:abstractNumId w:val="16"/>
-  </w:num>
-  <w:num w:numId="16" w16cid:durableId="16203515">
-    <w:abstractNumId w:val="15"/>
-  </w:num>
-  <w:num w:numId="17" w16cid:durableId="2138449025">
-    <w:abstractNumId w:val="7"/>
-  </w:num>
   <w:num w:numId="18" w16cid:durableId="1699356353">
-    <w:abstractNumId w:val="17"/>
+    <w:abstractNumId w:val="18"/>
   </w:num>
   <w:num w:numId="19" w16cid:durableId="247543886">
     <w:abstractNumId w:val="0"/>
   </w:num>
   <w:num w:numId="20" w16cid:durableId="96146553">
-    <w:abstractNumId w:val="4"/>
+    <w:abstractNumId w:val="5"/>
   </w:num>
   <w:num w:numId="21" w16cid:durableId="980884564">
-    <w:abstractNumId w:val="19"/>
+    <w:abstractNumId w:val="20"/>
+  </w:num>
+  <w:num w:numId="22" w16cid:durableId="1824274949">
+    <w:abstractNumId w:val="2"/>
   </w:num>
 </w:numbering>
 </file>
@@ -5564,6 +5816,22 @@
       <w:bCs/>
     </w:rPr>
   </w:style>
+  <w:style w:type="paragraph" w:styleId="NormalWeb">
+    <w:name w:val="Normal (Web)"/>
+    <w:basedOn w:val="Normal"/>
+    <w:uiPriority w:val="99"/>
+    <w:unhideWhenUsed/>
+    <w:rsid w:val="007B0269"/>
+    <w:pPr>
+      <w:spacing w:before="100" w:beforeAutospacing="1" w:after="100" w:afterAutospacing="1" w:line="240" w:lineRule="auto"/>
+    </w:pPr>
+    <w:rPr>
+      <w:rFonts w:ascii="Times New Roman" w:eastAsia="Times New Roman" w:hAnsi="Times New Roman" w:cs="Times New Roman"/>
+      <w:kern w:val="0"/>
+      <w:lang w:eastAsia="es-PE"/>
+      <w14:ligatures w14:val="none"/>
+    </w:rPr>
+  </w:style>
 </w:styles>
 </file>
 

</xml_diff>